<commit_message>
계약서 v6: 갑 연락처/이메일 수정 (010-8226-9574, ondadaad@gmail.com)
</commit_message>
<xml_diff>
--- a/docs/contracts/온라인_마케팅_계약서_안전보장형_v6.docx
+++ b/docs/contracts/온라인_마케팅_계약서_안전보장형_v6.docx
@@ -317,7 +317,7 @@
               <w:rPr>
                 <w:sz w:val="18"/>
               </w:rPr>
-              <w:t>010-2420-8657</w:t>
+              <w:t>010-8226-9574</w:t>
             </w:r>
           </w:p>
         </w:tc>
@@ -357,7 +357,7 @@
               <w:rPr>
                 <w:sz w:val="18"/>
               </w:rPr>
-              <w:t>cocoz0707@gmail.com</w:t>
+              <w:t>ondadaad@gmail.com</w:t>
             </w:r>
           </w:p>
         </w:tc>

</xml_diff>